<commit_message>
PH submit-now docx: collapse v2 back to clean name (plain-English maker comment)
Co-Authored-By: Claude Opus 4.8 (1M context) <noreply@anthropic.com>
</commit_message>
<xml_diff>
--- a/launch-assets/AI-Stock-Assist-Product-Hunt-SUBMIT-NOW.docx
+++ b/launch-assets/AI-Stock-Assist-Product-Hunt-SUBMIT-NOW.docx
@@ -925,29 +925,29 @@
         <w:br/>
         <w:t>Type up to 10 tickers and in ~30 seconds you get a real, defensible verdict:</w:t>
         <w:br/>
-        <w:t>• BUY / HOLD / SELL with a confidence rating AND the reasoning — powered by Google Gemini 3.5 Flash</w:t>
+        <w:t>• BUY / HOLD / SELL with a confidence score AND the reasoning behind it — powered by Google Gemini 3.5 Flash</w:t>
         <w:br/>
-        <w:t>• 50+ fundamentals weighed across two consistent frameworks — Graham Value and Growth &amp; Quality (cash-flow focused): FCF Yield, P/FCF, OCF/NI, Payout Ratio, a Balance Sheet Health score, and more</w:t>
+        <w:t>• 50+ fundamentals weighed two ways: classic value (Graham) and cash-flow quality (does the business actually generate cash?)</w:t>
         <w:br/>
-        <w:t>• A Two-Lenses view that puts the Wall Street rating next to our methodology verdict and explains when each applies</w:t>
+        <w:t>• A "Two-Lenses" view that shows the Wall Street rating next to ours — and explains when each one is right for you</w:t>
         <w:br/>
-        <w:t>• Compare a whole watchlist at once and get a single Top Pick</w:t>
+        <w:t>• Compare a whole watchlist at once and get one clear Top Pick</w:t>
         <w:br/>
-        <w:t>• Honest about gaps: no TTM profit? P/E shows N/A and it leans on cash flow instead of pretending the stock is "cheap" — and it caps confidence accordingly</w:t>
+        <w:t>• Refreshingly honest: when the data is thin, it tells you and dials down its confidence — it won't pretend a risky stock is a safe "bargain"</w:t>
         <w:br/>
         <w:t>• Export the full report to PDF or Word</w:t>
         <w:br/>
         <w:br/>
-        <w:t>Built with a stack I love: Vercel (frontend + serverless), FastAPI on Render, Supabase (auth + the saved analysis history), Cloudflare, and Stripe — shoutouts above 🙏</w:t>
+        <w:t>Built with a stack I love: Vercel (frontend + serverless), FastAPI on Render, Supabase (auth + saved analysis history), Cloudflare, and Stripe — shoutouts above 🙏</w:t>
         <w:br/>
         <w:br/>
-        <w:t>The recent Gemini 3.5 Flash upgrade is why I'm launching now — it made the analysis noticeably faster and sharper, so you get better information, faster, to make higher-quality decisions.</w:t>
+        <w:t>The recent Gemini 3.5 Flash upgrade is why I'm launching now — it made the analysis noticeably faster and sharper.</w:t>
         <w:br/>
         <w:br/>
-        <w:t>It's 3 free analyses, no credit card — then packs from $4.99 (≈25¢ per analysis). No subscription.</w:t>
+        <w:t>3 free analyses, no credit card — then packs from $4.99 (≈25¢ each). No subscription.</w:t>
         <w:br/>
         <w:br/>
-        <w:t>I'd genuinely love your honest feedback — drop a ticker you're researching and I'll tell you what the framework says 👇</w:t>
+        <w:t>I'd love your honest feedback — drop a ticker you're researching and I'll tell you what the framework says 👇</w:t>
       </w:r>
     </w:p>
     <w:p>

</xml_diff>